<commit_message>
refactor(datamap): decompose into modular subprograms and add QA tests
</commit_message>
<xml_diff>
--- a/logdoc/demo/sample.docx
+++ b/logdoc/demo/sample.docx
@@ -2345,7 +2345,7 @@
               <a:graphicData uri="http://schemas.openxmlformats.org/drawingml/2006/picture">
                 <pic:pic xmlns:pic="http://schemas.openxmlformats.org/drawingml/2006/picture">
                   <pic:nvPicPr>
-                    <pic:cNvPr id="716969218" name=""/>
+                    <pic:cNvPr id="1635936113" name=""/>
                     <pic:cNvPicPr>
                       <a:picLocks noChangeAspect="1"/>
                     </pic:cNvPicPr>
@@ -2464,8 +2464,8 @@
       </w:r>
     </w:p>
     <w:sectPr>
-      <w:pgMar w:header="720" w:footer="720"/>
-      <w:cols w:space="720"/>
+      <w:pgMar w:header="708" w:footer="708"/>
+      <w:cols w:space="708"/>
     </w:sectPr>
   </w:body>
 </w:document>
@@ -2634,7 +2634,7 @@
       <w:spacing w:line="372" w:lineRule="atLeast"/>
     </w:pPr>
     <w:rPr>
-      <w:rFonts w:ascii="Roboto" w:eastAsia="Roboto" w:hAnsi="Roboto" w:cs="Roboto"/>
+      <w:rFonts w:ascii="-apple-system" w:eastAsia="-apple-system" w:hAnsi="-apple-system" w:cs="-apple-system"/>
       <w:color w:val="212529"/>
       <w:sz w:val="24"/>
       <w:szCs w:val="24"/>

</xml_diff>